<commit_message>
docs: add detailed notes and comparisons for offline vs online evaluations
</commit_message>
<xml_diff>
--- a/resources/05-llm-eval-as-judge/01-llm-eval-as-judge.docx
+++ b/resources/05-llm-eval-as-judge/01-llm-eval-as-judge.docx
@@ -8,7 +8,7 @@
           <w:noProof/>
         </w:rPr>
         <w:drawing>
-          <wp:inline distT="0" distB="0" distL="0" distR="0" wp14:anchorId="1E9AEF81" wp14:editId="3E1ED6E4">
+          <wp:inline distT="0" distB="0" distL="0" distR="0" wp14:anchorId="1E9AEF81" wp14:editId="263F697E">
             <wp:extent cx="5731510" cy="4392930"/>
             <wp:effectExtent l="0" t="0" r="2540" b="7620"/>
             <wp:docPr id="1455012455" name="Picture 1"/>
@@ -207,6 +207,9 @@
         </w:drawing>
       </w:r>
       <w:r>
+        <w:rPr>
+          <w:noProof/>
+        </w:rPr>
         <w:drawing>
           <wp:inline distT="0" distB="0" distL="0" distR="0" wp14:anchorId="3AB83187" wp14:editId="4B81E3C5">
             <wp:extent cx="5731510" cy="2234565"/>
@@ -244,6 +247,9 @@
         </w:drawing>
       </w:r>
       <w:r>
+        <w:rPr>
+          <w:noProof/>
+        </w:rPr>
         <w:lastRenderedPageBreak/>
         <w:drawing>
           <wp:inline distT="0" distB="0" distL="0" distR="0" wp14:anchorId="2B9224CC" wp14:editId="5555D5DD">
@@ -282,6 +288,9 @@
         </w:drawing>
       </w:r>
       <w:r>
+        <w:rPr>
+          <w:noProof/>
+        </w:rPr>
         <w:drawing>
           <wp:inline distT="0" distB="0" distL="0" distR="0" wp14:anchorId="3C5BEDFD" wp14:editId="4D27EC95">
             <wp:extent cx="5731510" cy="2996565"/>
@@ -319,6 +328,9 @@
         </w:drawing>
       </w:r>
       <w:r>
+        <w:rPr>
+          <w:noProof/>
+        </w:rPr>
         <w:lastRenderedPageBreak/>
         <w:drawing>
           <wp:inline distT="0" distB="0" distL="0" distR="0" wp14:anchorId="5E5624E9" wp14:editId="370B93F0">
@@ -357,6 +369,9 @@
         </w:drawing>
       </w:r>
       <w:r>
+        <w:rPr>
+          <w:noProof/>
+        </w:rPr>
         <w:drawing>
           <wp:inline distT="0" distB="0" distL="0" distR="0" wp14:anchorId="277B5B6F" wp14:editId="32F2E5EF">
             <wp:extent cx="5731510" cy="2672715"/>
@@ -394,6 +409,9 @@
         </w:drawing>
       </w:r>
       <w:r>
+        <w:rPr>
+          <w:noProof/>
+        </w:rPr>
         <w:lastRenderedPageBreak/>
         <w:drawing>
           <wp:inline distT="0" distB="0" distL="0" distR="0" wp14:anchorId="762FF735" wp14:editId="5C51D22E">
@@ -432,6 +450,9 @@
         </w:drawing>
       </w:r>
       <w:r>
+        <w:rPr>
+          <w:noProof/>
+        </w:rPr>
         <w:lastRenderedPageBreak/>
         <w:drawing>
           <wp:inline distT="0" distB="0" distL="0" distR="0" wp14:anchorId="380AEE72" wp14:editId="20AE27E5">
@@ -470,6 +491,9 @@
         </w:drawing>
       </w:r>
       <w:r>
+        <w:rPr>
+          <w:noProof/>
+        </w:rPr>
         <w:lastRenderedPageBreak/>
         <w:drawing>
           <wp:inline distT="0" distB="0" distL="0" distR="0" wp14:anchorId="5A74EE64" wp14:editId="71D7CDD5">
@@ -508,6 +532,9 @@
         </w:drawing>
       </w:r>
       <w:r>
+        <w:rPr>
+          <w:noProof/>
+        </w:rPr>
         <w:lastRenderedPageBreak/>
         <w:drawing>
           <wp:inline distT="0" distB="0" distL="0" distR="0" wp14:anchorId="411C997D" wp14:editId="251DBD6A">
@@ -546,6 +573,9 @@
         </w:drawing>
       </w:r>
       <w:r>
+        <w:rPr>
+          <w:noProof/>
+        </w:rPr>
         <w:lastRenderedPageBreak/>
         <w:drawing>
           <wp:inline distT="0" distB="0" distL="0" distR="0" wp14:anchorId="1CF870F3" wp14:editId="32D8708A">
@@ -584,7 +614,9 @@
         </w:drawing>
       </w:r>
       <w:r>
-        <w:lastRenderedPageBreak/>
+        <w:rPr>
+          <w:noProof/>
+        </w:rPr>
         <w:drawing>
           <wp:inline distT="0" distB="0" distL="0" distR="0" wp14:anchorId="5FF1AC43" wp14:editId="572A1E28">
             <wp:extent cx="5731510" cy="3124835"/>
@@ -622,6 +654,10 @@
         </w:drawing>
       </w:r>
       <w:r>
+        <w:rPr>
+          <w:noProof/>
+        </w:rPr>
+        <w:lastRenderedPageBreak/>
         <w:drawing>
           <wp:inline distT="0" distB="0" distL="0" distR="0" wp14:anchorId="7B57BB4E" wp14:editId="51972734">
             <wp:extent cx="5731510" cy="2741295"/>
@@ -647,6 +683,43 @@
                     <a:xfrm>
                       <a:off x="0" y="0"/>
                       <a:ext cx="5731510" cy="2741295"/>
+                    </a:xfrm>
+                    <a:prstGeom prst="rect">
+                      <a:avLst/>
+                    </a:prstGeom>
+                  </pic:spPr>
+                </pic:pic>
+              </a:graphicData>
+            </a:graphic>
+          </wp:inline>
+        </w:drawing>
+      </w:r>
+      <w:r>
+        <w:drawing>
+          <wp:inline distT="0" distB="0" distL="0" distR="0" wp14:anchorId="42D32F5A" wp14:editId="3ACC761F">
+            <wp:extent cx="3520745" cy="655377"/>
+            <wp:effectExtent l="0" t="0" r="3810" b="0"/>
+            <wp:docPr id="34942168" name="Picture 1"/>
+            <wp:cNvGraphicFramePr>
+              <a:graphicFrameLocks xmlns:a="http://schemas.openxmlformats.org/drawingml/2006/main" noChangeAspect="1"/>
+            </wp:cNvGraphicFramePr>
+            <a:graphic xmlns:a="http://schemas.openxmlformats.org/drawingml/2006/main">
+              <a:graphicData uri="http://schemas.openxmlformats.org/drawingml/2006/picture">
+                <pic:pic xmlns:pic="http://schemas.openxmlformats.org/drawingml/2006/picture">
+                  <pic:nvPicPr>
+                    <pic:cNvPr id="34942168" name=""/>
+                    <pic:cNvPicPr/>
+                  </pic:nvPicPr>
+                  <pic:blipFill>
+                    <a:blip r:embed="rId21"/>
+                    <a:stretch>
+                      <a:fillRect/>
+                    </a:stretch>
+                  </pic:blipFill>
+                  <pic:spPr>
+                    <a:xfrm>
+                      <a:off x="0" y="0"/>
+                      <a:ext cx="3520745" cy="655377"/>
                     </a:xfrm>
                     <a:prstGeom prst="rect">
                       <a:avLst/>
@@ -1586,6 +1659,16 @@
       <w:spacing w:val="5"/>
     </w:rPr>
   </w:style>
+  <w:style w:type="paragraph" w:styleId="Revision">
+    <w:name w:val="Revision"/>
+    <w:hidden/>
+    <w:uiPriority w:val="99"/>
+    <w:semiHidden/>
+    <w:rsid w:val="00FB2F0A"/>
+    <w:pPr>
+      <w:spacing w:after="0" w:line="240" w:lineRule="auto"/>
+    </w:pPr>
+  </w:style>
 </w:styles>
 </file>
 

</xml_diff>